<commit_message>
feat(coursework): finalize lab2 checks and stage lab3 plan
</commit_message>
<xml_diff>
--- a/docs/foundation/artifact-map.docx
+++ b/docs/foundation/artifact-map.docx
@@ -731,6 +731,7 @@
     <w:rsid w:val="00FC693F"/>
     <w:rPr>
       <w:rFonts w:ascii="Times New Roman" w:hAnsi="Times New Roman" w:eastAsia="宋体"/>
+      <w:color w:val="000000"/>
       <w:sz w:val="24"/>
     </w:rPr>
   </w:style>
@@ -793,11 +794,11 @@
       <w:outlineLvl w:val="0"/>
     </w:pPr>
     <w:rPr>
-      <w:rFonts w:asciiTheme="majorHAnsi" w:eastAsiaTheme="majorEastAsia" w:hAnsiTheme="majorHAnsi" w:cstheme="majorBidi" w:ascii="黑体" w:hAnsi="黑体" w:eastAsia="黑体"/>
+      <w:rFonts w:asciiTheme="majorHAnsi" w:eastAsiaTheme="majorEastAsia" w:hAnsiTheme="majorHAnsi" w:cstheme="majorBidi" w:ascii="Times New Roman" w:hAnsi="Times New Roman" w:eastAsia="黑体"/>
       <w:b/>
       <w:bCs/>
-      <w:color w:val="365F91" w:themeColor="accent1" w:themeShade="BF"/>
-      <w:sz w:val="28"/>
+      <w:color w:val="000000"/>
+      <w:sz w:val="32"/>
       <w:szCs w:val="28"/>
     </w:rPr>
   </w:style>
@@ -817,11 +818,11 @@
       <w:outlineLvl w:val="1"/>
     </w:pPr>
     <w:rPr>
-      <w:rFonts w:asciiTheme="majorHAnsi" w:eastAsiaTheme="majorEastAsia" w:hAnsiTheme="majorHAnsi" w:cstheme="majorBidi" w:ascii="黑体" w:hAnsi="黑体" w:eastAsia="黑体"/>
+      <w:rFonts w:asciiTheme="majorHAnsi" w:eastAsiaTheme="majorEastAsia" w:hAnsiTheme="majorHAnsi" w:cstheme="majorBidi" w:ascii="Times New Roman" w:hAnsi="Times New Roman" w:eastAsia="黑体"/>
       <w:b/>
       <w:bCs/>
-      <w:color w:val="4F81BD" w:themeColor="accent1"/>
-      <w:sz w:val="26"/>
+      <w:color w:val="000000"/>
+      <w:sz w:val="28"/>
       <w:szCs w:val="26"/>
     </w:rPr>
   </w:style>
@@ -844,7 +845,7 @@
       <w:rFonts w:asciiTheme="majorHAnsi" w:eastAsiaTheme="majorEastAsia" w:hAnsiTheme="majorHAnsi" w:cstheme="majorBidi"/>
       <w:b/>
       <w:bCs/>
-      <w:color w:val="4F81BD" w:themeColor="accent1"/>
+      <w:color w:val="000000"/>
     </w:rPr>
   </w:style>
   <w:style w:type="paragraph" w:styleId="Heading4">
@@ -1082,11 +1083,11 @@
       <w:contextualSpacing/>
     </w:pPr>
     <w:rPr>
-      <w:rFonts w:asciiTheme="majorHAnsi" w:eastAsiaTheme="majorEastAsia" w:hAnsiTheme="majorHAnsi" w:cstheme="majorBidi" w:ascii="黑体" w:hAnsi="黑体" w:eastAsia="黑体"/>
-      <w:color w:val="17365D" w:themeColor="text2" w:themeShade="BF"/>
+      <w:rFonts w:asciiTheme="majorHAnsi" w:eastAsiaTheme="majorEastAsia" w:hAnsiTheme="majorHAnsi" w:cstheme="majorBidi" w:ascii="Times New Roman" w:hAnsi="Times New Roman" w:eastAsia="黑体"/>
+      <w:color w:val="000000"/>
       <w:spacing w:val="5"/>
       <w:kern w:val="28"/>
-      <w:sz w:val="52"/>
+      <w:sz w:val="36"/>
       <w:szCs w:val="52"/>
     </w:rPr>
   </w:style>
@@ -1262,6 +1263,9 @@
       </w:numPr>
       <w:contextualSpacing/>
     </w:pPr>
+    <w:rPr>
+      <w:color w:val="000000"/>
+    </w:rPr>
   </w:style>
   <w:style w:type="paragraph" w:styleId="ListBullet2">
     <w:name w:val="List Bullet 2"/>
@@ -1301,6 +1305,9 @@
       </w:numPr>
       <w:contextualSpacing/>
     </w:pPr>
+    <w:rPr>
+      <w:color w:val="000000"/>
+    </w:rPr>
   </w:style>
   <w:style w:type="paragraph" w:styleId="ListNumber2">
     <w:name w:val="List Number 2"/>

</xml_diff>